<commit_message>
Fixes of issues found by AR
</commit_message>
<xml_diff>
--- a/docs/manuscript/manuscript.docx
+++ b/docs/manuscript/manuscript.docx
@@ -112,7 +112,7 @@
       </w:pPr>
     </w:p>
     <w:bookmarkEnd w:id="10"/>
-    <w:bookmarkStart w:id="17" w:name="introduction"/>
+    <w:bookmarkStart w:id="15" w:name="introduction"/>
     <w:p>
       <w:pPr>
         <w:pStyle w:val="Heading1"/>
@@ -121,13 +121,13 @@
         <w:t xml:space="preserve">Introduction</w:t>
       </w:r>
     </w:p>
-    <w:bookmarkStart w:id="11" w:name="Xfddf7da9115ce5b4a1cbc16f602f71907657c0d"/>
+    <w:bookmarkStart w:id="11" w:name="causal-reasoning-in-spatial-multi-omics"/>
     <w:p>
       <w:pPr>
         <w:pStyle w:val="Heading2"/>
       </w:pPr>
       <w:r>
-        <w:t xml:space="preserve">Causal reasoning methods Spatial multi-omics .</w:t>
+        <w:t xml:space="preserve">Causal Reasoning in Spatial Multi-omics</w:t>
       </w:r>
     </w:p>
     <w:p>
@@ -306,7 +306,7 @@
       </w:r>
     </w:p>
     <w:bookmarkEnd w:id="12"/>
-    <w:bookmarkStart w:id="16" w:name="Xcbccb0444087fd34e7f0f6b4d0c4babcde8aa25"/>
+    <w:bookmarkStart w:id="13" w:name="Xcbccb0444087fd34e7f0f6b4d0c4babcde8aa25"/>
     <w:p>
       <w:pPr>
         <w:pStyle w:val="Heading2"/>
@@ -455,53 +455,31 @@
         <w:t xml:space="preserve">.</w:t>
       </w:r>
     </w:p>
-    <w:p>
-      <w:pPr>
-        <w:pStyle w:val="CaptionedFigure"/>
-      </w:pPr>
-      <w:r>
-        <w:drawing>
-          <wp:inline>
-            <wp:extent cx="3409315" cy="2824996"/>
-            <wp:effectExtent b="0" l="0" r="0" t="0"/>
-            <wp:docPr descr="A table with a number of numbers and symbols AI-generated content may be incorrect." title="" id="14" name="Picture"/>
-            <a:graphic>
-              <a:graphicData uri="http://schemas.openxmlformats.org/drawingml/2006/picture">
-                <pic:pic>
-                  <pic:nvPicPr>
-                    <pic:cNvPr descr="figures/table1_siv_comparison.png" id="15" name="Picture"/>
-                    <pic:cNvPicPr>
-                      <a:picLocks noChangeArrowheads="1" noChangeAspect="1"/>
-                    </pic:cNvPicPr>
-                  </pic:nvPicPr>
-                  <pic:blipFill>
-                    <a:blip r:embed="rId13"/>
-                    <a:stretch>
-                      <a:fillRect/>
-                    </a:stretch>
-                  </pic:blipFill>
-                  <pic:spPr bwMode="auto">
-                    <a:xfrm>
-                      <a:off x="0" y="0"/>
-                      <a:ext cx="3409315" cy="2824996"/>
-                    </a:xfrm>
-                    <a:prstGeom prst="rect">
-                      <a:avLst/>
-                    </a:prstGeom>
-                    <a:noFill/>
-                    <a:ln w="9525">
-                      <a:noFill/>
-                      <a:headEnd/>
-                      <a:tailEnd/>
-                    </a:ln>
-                  </pic:spPr>
-                </pic:pic>
-              </a:graphicData>
-            </a:graphic>
-          </wp:inline>
-        </w:drawing>
-      </w:r>
-    </w:p>
+    <w:tbl>
+      <w:tblPr>
+        <w:tblStyle w:val="FigureTable"/>
+        <w:tblW w:type="auto" w:w="0"/>
+        <w:jc w:val="center"/>
+        <w:tblLook w:firstRow="0" w:lastRow="0" w:firstColumn="0" w:lastColumn="0"/>
+      </w:tblPr>
+      <w:tblGrid>
+        <w:gridCol w:w="7920"/>
+      </w:tblGrid>
+      <w:tr>
+        <w:tc>
+          <w:tcPr/>
+          <w:p>
+            <w:pPr>
+              <w:pStyle w:val="Compact"/>
+              <w:jc w:val="center"/>
+            </w:pPr>
+            <w:r>
+              <w:t xml:space="preserve">A table with a number of numbers and symbols AI-generated content may be incorrect.</w:t>
+            </w:r>
+          </w:p>
+        </w:tc>
+      </w:tr>
+    </w:tbl>
     <w:p>
       <w:pPr>
         <w:pStyle w:val="ImageCaption"/>
@@ -522,25 +500,27 @@
         <w:t xml:space="preserve">. Practical considerations such as event frequency, known limitations, instrumental variable utility, and disease specificity are also indicated. Qualitative ratings reflect relative suitability: (+++) strong, (++) moderate, (+) limited, (±) context-dependent, and (–) generally unsuitable.</w:t>
       </w:r>
     </w:p>
-    <w:p>
-      <w:pPr>
-        <w:pStyle w:val="BodyText"/>
-      </w:pPr>
-      <w:r>
-        <w:t xml:space="preserve">Framework and scope</w:t>
-      </w:r>
-    </w:p>
-    <w:p>
-      <w:pPr>
-        <w:pStyle w:val="BodyText"/>
+    <w:bookmarkEnd w:id="13"/>
+    <w:bookmarkStart w:id="14" w:name="framework-and-scope"/>
+    <w:p>
+      <w:pPr>
+        <w:pStyle w:val="Heading2"/>
+      </w:pPr>
+      <w:r>
+        <w:t xml:space="preserve">Framework and Scope</w:t>
+      </w:r>
+    </w:p>
+    <w:p>
+      <w:pPr>
+        <w:pStyle w:val="FirstParagraph"/>
       </w:pPr>
       <w:r>
         <w:t xml:space="preserve">In this work, we formalize the SIV framework within a structural causal model appropriate for spatial tumor biology, derive the statistical estimators, diagnostics, and sensitivity analyses needed for rigorous causal inference, and develop a Causal Analysis Using Somatic And Neighborhood Tissue Architecture (CAUSANTA), an analysis and simulation that embeds known causal structure into realistic tumor tissue to enable validation of causal discovery methods against ground truth. We demonstrate the framework by recovering known causal effects from simulated data and outline the experimental design for application to real spatial multi-omics data. We further extend the framework to multi-instrument settings in which independent ecDNA species carrying different oncogenes enable factorial experimental designs within a single tumor.</w:t>
       </w:r>
     </w:p>
-    <w:bookmarkEnd w:id="16"/>
-    <w:bookmarkEnd w:id="17"/>
-    <w:bookmarkStart w:id="27" w:name="methods"/>
+    <w:bookmarkEnd w:id="14"/>
+    <w:bookmarkEnd w:id="15"/>
+    <w:bookmarkStart w:id="25" w:name="methods"/>
     <w:p>
       <w:pPr>
         <w:pStyle w:val="Heading1"/>
@@ -549,7 +529,7 @@
         <w:t xml:space="preserve">Methods</w:t>
       </w:r>
     </w:p>
-    <w:bookmarkStart w:id="18" w:name="X795f001983263b66eb657abe44ad3cbb7cd7dca"/>
+    <w:bookmarkStart w:id="16" w:name="X795f001983263b66eb657abe44ad3cbb7cd7dca"/>
     <w:p>
       <w:pPr>
         <w:pStyle w:val="Heading2"/>
@@ -846,8 +826,8 @@
         <w:t xml:space="preserve"> = independent noise terms representing biological variability</w:t>
       </w:r>
     </w:p>
-    <w:bookmarkEnd w:id="18"/>
-    <w:bookmarkStart w:id="19" w:name="structural-equations"/>
+    <w:bookmarkEnd w:id="16"/>
+    <w:bookmarkStart w:id="17" w:name="structural-equations"/>
     <w:p>
       <w:pPr>
         <w:pStyle w:val="Heading2"/>
@@ -898,14 +878,14 @@
           <m:t>=</m:t>
         </m:r>
         <m:r>
-          <m:t>1.0</m:t>
+          <m:t>2.89</m:t>
         </m:r>
       </m:oMath>
       <w:r>
         <w:t xml:space="preserve"> </w:t>
       </w:r>
       <w:r>
-        <w:t xml:space="preserve">is baseline EGFR expression from the chromosomal copy,</w:t>
+        <w:t xml:space="preserve">is baseline EGFR expression (reflecting population-level effects including hypoxia),</w:t>
       </w:r>
       <w:r>
         <w:t xml:space="preserve"> </w:t>
@@ -921,7 +901,7 @@
           <m:t>=</m:t>
         </m:r>
         <m:r>
-          <m:t>0.5</m:t>
+          <m:t>1.21</m:t>
         </m:r>
       </m:oMath>
       <w:r>
@@ -1011,18 +991,19 @@
           <m:r>
             <m:t>X</m:t>
           </m:r>
-          <m:r>
-            <m:rPr>
-              <m:sty m:val="p"/>
-            </m:rPr>
-            <m:t>:</m:t>
-          </m:r>
-          <m:r>
-            <m:rPr>
-              <m:sty m:val="p"/>
-            </m:rPr>
-            <m:t>=</m:t>
-          </m:r>
+          <m:box>
+            <m:boxPr>
+              <m:opEmu m:val="on"/>
+            </m:boxPr>
+            <m:e>
+              <m:r>
+                <m:rPr>
+                  <m:sty m:val="p"/>
+                </m:rPr>
+                <m:t>:=</m:t>
+              </m:r>
+            </m:e>
+          </m:box>
           <m:sSub>
             <m:e>
               <m:r>
@@ -1074,22 +1055,9 @@
             </m:rPr>
             <m:t>=</m:t>
           </m:r>
-          <m:sSub>
-            <m:e>
-              <m:r>
-                <m:t>X</m:t>
-              </m:r>
-            </m:e>
-            <m:sub>
-              <m:r>
-                <m:rPr>
-                  <m:nor/>
-                  <m:sty m:val="p"/>
-                </m:rPr>
-                <m:t>base</m:t>
-              </m:r>
-            </m:sub>
-          </m:sSub>
+          <m:r>
+            <m:t>2.89</m:t>
+          </m:r>
           <m:r>
             <m:rPr>
               <m:sty m:val="p"/>
@@ -1097,7 +1065,7 @@
             <m:t>+</m:t>
           </m:r>
           <m:r>
-            <m:t>κ</m:t>
+            <m:t>1.21</m:t>
           </m:r>
           <m:r>
             <m:rPr>
@@ -1106,13 +1074,10 @@
             <m:t>⋅</m:t>
           </m:r>
           <m:r>
-            <m:t>m</m:t>
-          </m:r>
-          <m:r>
-            <m:t>i</m:t>
-          </m:r>
-          <m:r>
-            <m:t>n</m:t>
+            <m:rPr>
+              <m:sty m:val="p"/>
+            </m:rPr>
+            <m:t>min</m:t>
           </m:r>
           <m:r>
             <m:rPr>
@@ -1295,7 +1260,7 @@
           <m:t>=</m:t>
         </m:r>
         <m:r>
-          <m:t>10</m:t>
+          <m:t>18</m:t>
         </m:r>
       </m:oMath>
       <w:r>
@@ -1435,7 +1400,7 @@
           <m:t>=</m:t>
         </m:r>
         <m:r>
-          <m:t>36</m:t>
+          <m:t>24</m:t>
         </m:r>
       </m:oMath>
       <w:r>
@@ -2570,8 +2535,8 @@
         </m:oMath>
       </m:oMathPara>
     </w:p>
-    <w:bookmarkEnd w:id="19"/>
-    <w:bookmarkStart w:id="20" w:name="the-confounding-structure"/>
+    <w:bookmarkEnd w:id="17"/>
+    <w:bookmarkStart w:id="18" w:name="the-confounding-structure"/>
     <w:p>
       <w:pPr>
         <w:pStyle w:val="Heading2"/>
@@ -2943,8 +2908,8 @@
         <w:t xml:space="preserve">This is valid because: (1) Z affects X (relevance: gene dosage), (2) Z ⊥⊥ U_O2 (independence: random segregation), and (3) Z affects Y only through X (exclusion: ecDNA acts via gene expression).</w:t>
       </w:r>
     </w:p>
-    <w:bookmarkEnd w:id="20"/>
-    <w:bookmarkStart w:id="21" w:name="predicted-bias-direction"/>
+    <w:bookmarkEnd w:id="18"/>
+    <w:bookmarkStart w:id="19" w:name="predicted-bias-direction"/>
     <w:p>
       <w:pPr>
         <w:pStyle w:val="Heading2"/>
@@ -2974,8 +2939,8 @@
         <w:t xml:space="preserve">. The reasoning is as follows. Hypoxia (low O2) causes both increased EGFR expression (via HIF-1α transcriptional upregulation) and increased phenotypic activity (VEGF secretion via HIF-1α, migration via Go-or-Grow). Cells in hypoxic regions therefore have both high EGFR and high VEGF/migration, creating a spurious positive association that inflates the OLS coefficient above the true causal effect. The magnitude of bias depends on the strength of the hypoxia-EGFR coupling (HIF-1α upregulation effect) and the hypoxia-outcome coupling (HIF-1α effects on VEGF, Go-or-Grow effects on migration). This prediction is testable in simulation where ground truth is known.</w:t>
       </w:r>
     </w:p>
-    <w:bookmarkEnd w:id="21"/>
-    <w:bookmarkStart w:id="22" w:name="two-stage-least-squares-estimation"/>
+    <w:bookmarkEnd w:id="19"/>
+    <w:bookmarkStart w:id="20" w:name="two-stage-least-squares-estimation"/>
     <w:p>
       <w:pPr>
         <w:pStyle w:val="Heading2"/>
@@ -3010,7 +2975,7 @@
         <w:t xml:space="preserve"> </w:t>
       </w:r>
       <w:r>
-        <w:t xml:space="preserve">capture only the variation in X attributable to the random instrument Z. In the second stage, we regress outcome on predicted exposure, wheretThe coefficient</w:t>
+        <w:t xml:space="preserve">capture only the variation in X attributable to the random instrument Z. In the second stage, we regress outcome on predicted exposure. The coefficient</w:t>
       </w:r>
       <w:r>
         <w:t xml:space="preserve"> </w:t>
@@ -3525,7 +3490,7 @@
           <m:t>=</m:t>
         </m:r>
         <m:r>
-          <m:t>0.5</m:t>
+          <m:t>1.21</m:t>
         </m:r>
       </m:oMath>
       <w:r>
@@ -3535,8 +3500,8 @@
         <w:t xml:space="preserve">units, and copy numbers range from 0 to 100+.</w:t>
       </w:r>
     </w:p>
-    <w:bookmarkEnd w:id="22"/>
-    <w:bookmarkStart w:id="23" w:name="sibling-comparison-design"/>
+    <w:bookmarkEnd w:id="20"/>
+    <w:bookmarkStart w:id="21" w:name="sibling-comparison-design"/>
     <w:p>
       <w:pPr>
         <w:pStyle w:val="Heading2"/>
@@ -3924,8 +3889,8 @@
         </m:oMath>
       </m:oMathPara>
     </w:p>
-    <w:bookmarkEnd w:id="23"/>
-    <w:bookmarkStart w:id="24" w:name="sensitivity-analysis"/>
+    <w:bookmarkEnd w:id="21"/>
+    <w:bookmarkStart w:id="22" w:name="sensitivity-analysis"/>
     <w:p>
       <w:pPr>
         <w:pStyle w:val="Heading2"/>
@@ -4030,8 +3995,8 @@
         </m:oMath>
       </m:oMathPara>
     </w:p>
-    <w:bookmarkEnd w:id="24"/>
-    <w:bookmarkStart w:id="25" w:name="causal-discovery"/>
+    <w:bookmarkEnd w:id="22"/>
+    <w:bookmarkStart w:id="23" w:name="causal-discovery"/>
     <w:p>
       <w:pPr>
         <w:pStyle w:val="Heading2"/>
@@ -4196,7 +4161,7 @@
           <m:t>=</m:t>
         </m:r>
         <m:r>
-          <m:t>5</m:t>
+          <m:t>2</m:t>
         </m:r>
       </m:oMath>
       <w:r>
@@ -4241,7 +4206,7 @@
           <m:t>=</m:t>
         </m:r>
         <m:r>
-          <m:t>60</m:t>
+          <m:t>40</m:t>
         </m:r>
       </m:oMath>
       <w:r>
@@ -4433,8 +4398,8 @@
         <w:t xml:space="preserve">We model the Immune System, where the immune module implements GBM-realistic immunosuppression through several calibrated parameters. Immunological synapse maturation requires 2.5 hours, and each synapse carries a 25% kill probability, substantially reduced from the 70% typically used in generic immune models. T cells become dysfunctional after approximately three kills, reflecting the exhaustion phenotype well documented in GBM. Activation requires high tumor proximity, and the recruitment rate is limited to 0.3% per hour to reflect restricted infiltration across the blood-brain barrier. Together, these parameters ensure that tumors grow despite immune pressure, matching the clinical reality of GBM immune evasion. We validate causal inference methods by comparing estimated effects to the ground-truth causal values configured in the simulation.</w:t>
       </w:r>
     </w:p>
-    <w:bookmarkEnd w:id="25"/>
-    <w:bookmarkStart w:id="26" w:name="output-analysis-validation"/>
+    <w:bookmarkEnd w:id="23"/>
+    <w:bookmarkStart w:id="24" w:name="output-analysis-validation"/>
     <w:p>
       <w:pPr>
         <w:pStyle w:val="Heading2"/>
@@ -4839,7 +4804,7 @@
               <w:jc w:val="left"/>
             </w:pPr>
             <w:r>
-              <w:t xml:space="preserve">36h</w:t>
+              <w:t xml:space="preserve">24h</w:t>
             </w:r>
           </w:p>
         </w:tc>
@@ -5021,24 +4986,88 @@
         <w:t xml:space="preserve">Simulation parameters and outputs available as supplementary material.</w:t>
       </w:r>
     </w:p>
+    <w:bookmarkEnd w:id="24"/>
+    <w:bookmarkEnd w:id="25"/>
+    <w:bookmarkStart w:id="49" w:name="results"/>
+    <w:p>
+      <w:pPr>
+        <w:pStyle w:val="Heading1"/>
+      </w:pPr>
+      <w:r>
+        <w:t xml:space="preserve">Results</w:t>
+      </w:r>
+    </w:p>
+    <w:bookmarkStart w:id="26" w:name="X1319c684a482c6d430dc44ca69dc90161761c1d"/>
+    <w:p>
+      <w:pPr>
+        <w:pStyle w:val="Heading2"/>
+      </w:pPr>
+      <w:r>
+        <w:t xml:space="preserve">The Causal Identification Problem in Tumor Biology</w:t>
+      </w:r>
+    </w:p>
+    <w:p>
+      <w:pPr>
+        <w:pStyle w:val="FirstParagraph"/>
+      </w:pPr>
+      <w:r>
+        <w:t xml:space="preserve">To illustrate the identification problem that SIV addresses, consider the relationship between EGFR expression and migration speed in glioblastoma. Naive regression of migration on EGFR yields a positive coefficient (β_OLS = 0.12, p &lt; 0.001), but this association admits multiple causal interpretations. The association could reflect a true causal effect where EGFR signaling activates pro-migratory pathways including PI3K/AKT, STAT3, and FAK, directly promoting cell motility and invasion. Alternatively, it could reflect reverse causation: invading cells encounter hypoxic or growth-factor-rich niches that upregulate EGFR expression. A third possibility is confounding by hypoxia, where low oxygen stabilizes HIF-1α, which simultaneously increases EGFR transcription and activates the</w:t>
+      </w:r>
+      <w:r>
+        <w:t xml:space="preserve"> </w:t>
+      </w:r>
+      <w:r>
+        <w:t xml:space="preserve">“Go or Grow”</w:t>
+      </w:r>
+      <w:r>
+        <w:t xml:space="preserve"> </w:t>
+      </w:r>
+      <w:r>
+        <w:t xml:space="preserve">migration program.</w:t>
+      </w:r>
+    </w:p>
+    <w:p>
+      <w:pPr>
+        <w:pStyle w:val="BodyText"/>
+      </w:pPr>
+      <w:r>
+        <w:t xml:space="preserve">Standard regression cannot distinguish these scenarios. Controlling for measured hypoxia markers (HIF-1α, VEGF, GLUT1) is insufficient because hypoxia is spatially heterogeneous at scales below measurement resolution and incompletely captured by any finite set of markers. The confounding bias can be substantial: in our simulations, OLS overestimates the true causal effect on VEGF secretion by 117% and on migration by 27%.</w:t>
+      </w:r>
+    </w:p>
     <w:bookmarkEnd w:id="26"/>
+    <w:bookmarkStart w:id="27" w:name="ecdna-as-a-somatic-instrumental-variable"/>
+    <w:p>
+      <w:pPr>
+        <w:pStyle w:val="Heading2"/>
+      </w:pPr>
+      <w:r>
+        <w:t xml:space="preserve">ecDNA as a Somatic Instrumental Variable</w:t>
+      </w:r>
+    </w:p>
+    <w:p>
+      <w:pPr>
+        <w:pStyle w:val="FirstParagraph"/>
+      </w:pPr>
+      <w:r>
+        <w:t xml:space="preserve">We propose that extrachromosomal DNA (ecDNA) provides a biologically grounded instrumental variable for causal inference in cancer spatial biology. ecDNA are circular, double-stranded DNA molecules ranging from 100 kb to several megabases that carry amplified oncogenes outside the chromosome. Unlike homogeneously staining regions (HSRs), which represent chromosomally integrated amplifications, ecDNA exist as autonomous genetic elements in the nucleus. They are found in approximately 30% of cancers across diverse histologies, with particularly high prevalence in glioblastoma (&gt;40%), neuroblastoma, and aggressive carcinomas of the breast, lung, and ovary.</w:t>
+      </w:r>
+    </w:p>
+    <w:p>
+      <w:pPr>
+        <w:pStyle w:val="BodyText"/>
+      </w:pPr>
+      <w:r>
+        <w:t xml:space="preserve">The molecular biology of ecDNA has been elucidated through a combination of metaphase FISH, circle-seq, and long-read sequencing. ecDNA arise through chromothripsis, breakage-fusion-bridge cycles, or other catastrophic genomic events that excise oncogene-containing regions from chromosomes. Once formed, ecDNA replicate during S phase using the same replication machinery as chromosomal DNA, but they lack three critical features: centromeres, telomeres, and regular chromatin compaction. The absence of centromeres is the key property for our framework.</w:t>
+      </w:r>
+    </w:p>
     <w:bookmarkEnd w:id="27"/>
-    <w:bookmarkStart w:id="51" w:name="results"/>
-    <w:p>
-      <w:pPr>
-        <w:pStyle w:val="Heading1"/>
-      </w:pPr>
-      <w:r>
-        <w:t xml:space="preserve">Results</w:t>
-      </w:r>
-    </w:p>
-    <w:bookmarkStart w:id="28" w:name="X1319c684a482c6d430dc44ca69dc90161761c1d"/>
+    <w:bookmarkStart w:id="28" w:name="the-mechanism-of-stochastic-segregation."/>
     <w:p>
       <w:pPr>
         <w:pStyle w:val="Heading2"/>
       </w:pPr>
       <w:r>
-        <w:t xml:space="preserve">The Causal Identification Problem in Tumor Biology</w:t>
+        <w:t xml:space="preserve">The mechanism of stochastic segregation.</w:t>
       </w:r>
     </w:p>
     <w:p>
@@ -5046,37 +5075,17 @@
         <w:pStyle w:val="FirstParagraph"/>
       </w:pPr>
       <w:r>
-        <w:t xml:space="preserve">To illustrate the identification problem that SIV addresses, consider the relationship between EGFR expression and migration speed in glioblastoma. Naive regression of migration on EGFR yields a positive coefficient (β_OLS = 0.12, p &lt; 0.001), but this association admits multiple causal interpretations. The association could reflect a true causal effect where EGFR signaling activates pro-migratory pathways including PI3K/AKT, STAT3, and FAK, directly promoting cell motility and invasion. Alternatively, it could reflect reverse causation: invading cells encounter hypoxic or growth-factor-rich niches that upregulate EGFR expression. A third possibility is confounding by hypoxia, where low oxygen stabilizes HIF-1α, which simultaneously increases EGFR transcription and activates the</w:t>
-      </w:r>
-      <w:r>
-        <w:t xml:space="preserve"> </w:t>
-      </w:r>
-      <w:r>
-        <w:t xml:space="preserve">“Go or Grow”</w:t>
-      </w:r>
-      <w:r>
-        <w:t xml:space="preserve"> </w:t>
-      </w:r>
-      <w:r>
-        <w:t xml:space="preserve">migration program.</w:t>
-      </w:r>
-    </w:p>
-    <w:p>
-      <w:pPr>
-        <w:pStyle w:val="BodyText"/>
-      </w:pPr>
-      <w:r>
-        <w:t xml:space="preserve">Standard regression cannot distinguish these scenarios. Controlling for measured hypoxia markers (HIF-1α, VEGF, GLUT1) is insufficient because hypoxia is spatially heterogeneous at scales below measurement resolution and incompletely captured by any finite set of markers. The confounding bias can be substantial: in our simulations, OLS overestimates the true causal effect on VEGF secretion by 117% and on migration by 27%.</w:t>
+        <w:t xml:space="preserve">During mitosis, chromosomal DNA is partitioned to daughter cells with &gt;99.9% fidelity via the spindle apparatus, which attaches to centromeric kinetochores and pulls sister chromatids to opposite poles. ecDNA, lacking centromeres, cannot attach to the spindle. Instead, they are passively distributed to daughter cells during cytokinesis, partitioned roughly equally by the cleavage furrow but with substantial stochastic variation. Single-cell DNA-FISH studies have demonstrated that the allocation of ecDNA to daughter cells follows approximately a Binomial(N, 0.5) distribution, where N is the copy number in the parent cell at the time of division.</w:t>
       </w:r>
     </w:p>
     <w:bookmarkEnd w:id="28"/>
-    <w:bookmarkStart w:id="29" w:name="ecdna-as-a-somatic-instrumental-variable"/>
+    <w:bookmarkStart w:id="29" w:name="X59cb9eb35e44263c56227ef77a0fbd509758e1c"/>
     <w:p>
       <w:pPr>
         <w:pStyle w:val="Heading2"/>
       </w:pPr>
       <w:r>
-        <w:t xml:space="preserve">ecDNA as a Somatic Instrumental Variable</w:t>
+        <w:t xml:space="preserve">This stochastic segregation has major consequences for intratumoral heterogeneity.</w:t>
       </w:r>
     </w:p>
     <w:p>
@@ -5084,25 +5093,17 @@
         <w:pStyle w:val="FirstParagraph"/>
       </w:pPr>
       <w:r>
-        <w:t xml:space="preserve">We propose that extrachromosomal DNA (ecDNA) provides a biologically grounded instrumental variable for causal inference in cancer spatial biology. ecDNA are circular, double-stranded DNA molecules ranging from 100 kb to several megabases that carry amplified oncogenes outside the chromosome. Unlike homogeneously staining regions (HSRs), which represent chromosomally integrated amplifications, ecDNA exist as autonomous genetic elements in the nucleus. They are found in approximately 30% of cancers across diverse histologies, with particularly high prevalence in glioblastoma (&gt;40%), neuroblastoma, and aggressive carcinomas of the breast, lung, and ovary.</w:t>
-      </w:r>
-    </w:p>
-    <w:p>
-      <w:pPr>
-        <w:pStyle w:val="BodyText"/>
-      </w:pPr>
-      <w:r>
-        <w:t xml:space="preserve">The molecular biology of ecDNA has been elucidated through a combination of metaphase FISH, circle-seq, and long-read sequencing. ecDNA arise through chromothripsis, breakage-fusion-bridge cycles, or other catastrophic genomic events that excise oncogene-containing regions from chromosomes. Once formed, ecDNA replicate during S phase using the same replication machinery as chromosomal DNA, but they lack three critical features: centromeres, telomeres, and regular chromatin compaction. The absence of centromeres is the key property for our framework.</w:t>
+        <w:t xml:space="preserve">Even genetically identical cells, clones derived from a single ancestor, rapidly diverge in ecDNA copy number as they proliferate. After just 10 cell divisions, sibling lineages can differ by an order of magnitude in copy number. This creates a natural dose-response experiment within the tumor: cells with high copy number overexpress the ecDNA-encoded oncogene, while cells with low copy number express it at near-normal levels, yet both share the same genetic background, spatial origin, and developmental history up to the point of segregation.</w:t>
       </w:r>
     </w:p>
     <w:bookmarkEnd w:id="29"/>
-    <w:bookmarkStart w:id="30" w:name="the-mechanism-of-stochastic-segregation."/>
+    <w:bookmarkStart w:id="30" w:name="gene-dosage-and-oncogene-expression."/>
     <w:p>
       <w:pPr>
         <w:pStyle w:val="Heading2"/>
       </w:pPr>
       <w:r>
-        <w:t xml:space="preserve">The mechanism of stochastic segregation.</w:t>
+        <w:t xml:space="preserve">Gene dosage and oncogene expression.</w:t>
       </w:r>
     </w:p>
     <w:p>
@@ -5110,17 +5111,17 @@
         <w:pStyle w:val="FirstParagraph"/>
       </w:pPr>
       <w:r>
-        <w:t xml:space="preserve">During mitosis, chromosomal DNA is partitioned to daughter cells with &gt;99.9% fidelity via the spindle apparatus, which attaches to centromeric kinetochores and pulls sister chromatids to opposite poles. ecDNA, lacking centromeres, cannot attach to the spindle. Instead, they are passively distributed to daughter cells during cytokinesis, partitioned roughly equally by the cleavage furrow but with substantial stochastic variation. Single-cell DNA-FISH studies have demonstrated that the allocation of ecDNA to daughter cells follows approximately a Binomial(N, 0.5) distribution, where N is the copy number in the parent cell at the time of division.</w:t>
+        <w:t xml:space="preserve">The oncogenes carried on ecDNA are among the most potent drivers in cancer. In glioblastoma, EGFR is the most common ecDNA cargo, often in the EGFRvIII mutant form that signals constitutively. Other common ecDNA oncogenes include MYC, MYCN, CDK4, MDM2, and PDGFRA. Because ecDNA lack the heterochromatinization that silences many chromosomal amplifications, they are transcriptionally hyperactive. ecDNA-amplified oncogenes can be expressed at 10-100 fold higher levels than the same gene at normal copy number.</w:t>
       </w:r>
     </w:p>
     <w:bookmarkEnd w:id="30"/>
-    <w:bookmarkStart w:id="31" w:name="X59cb9eb35e44263c56227ef77a0fbd509758e1c"/>
+    <w:bookmarkStart w:id="31" w:name="causal-simulation-for-ecdna-expansion."/>
     <w:p>
       <w:pPr>
         <w:pStyle w:val="Heading2"/>
       </w:pPr>
       <w:r>
-        <w:t xml:space="preserve">This stochastic segregation has major consequences for intratumoral heterogeneity.</w:t>
+        <w:t xml:space="preserve">Causal Simulation for ecDNA expansion.</w:t>
       </w:r>
     </w:p>
     <w:p>
@@ -5128,47 +5129,11 @@
         <w:pStyle w:val="FirstParagraph"/>
       </w:pPr>
       <w:r>
-        <w:t xml:space="preserve">Even genetically identical cells, clones derived from a single ancestor, rapidly diverge in ecDNA copy number as they proliferate. After just 10 cell divisions, sibling lineages can differ by an order of magnitude in copy number. This creates a natural dose-response experiment within the tumor: cells with high copy number overexpress the ecDNA-encoded oncogene, while cells with low copy number express it at near-normal levels, yet both share the same genetic background, spatial origin, and developmental history up to the point of segregation.</w:t>
+        <w:t xml:space="preserve">To validate causal inference methods, we developed CAUSANTA (Causal Analysis Using Somatic And Neighborhood Tissue Architecture), a simulation that generates synthetic tumor tissue with embedded, known causal structure. CAUSANTA implements a six-phase hourly loop. First, environment diffusion solves reaction-diffusion PDEs for oxygen, glucose, VEGF, and lactate with Neumann boundary conditions. Second, cell behaviors including division, apoptosis, migration, and state transitions execute in random order. Third, angiogenesis proceeds through VEGF-driven sprouting from existing vasculature. Fourth, immune cells infiltrate through chemokine-dependent recruitment. Fifth, necrotic cells undergo lysis and occupancy maps are updated. Sixth, the simulation writes TSV snapshots of cell states, environment fields, and lineage events. The simulation tracks nine cell types with distinct behaviors.</w:t>
       </w:r>
     </w:p>
     <w:bookmarkEnd w:id="31"/>
-    <w:bookmarkStart w:id="32" w:name="gene-dosage-and-oncogene-expression."/>
-    <w:p>
-      <w:pPr>
-        <w:pStyle w:val="Heading2"/>
-      </w:pPr>
-      <w:r>
-        <w:t xml:space="preserve">Gene dosage and oncogene expression.</w:t>
-      </w:r>
-    </w:p>
-    <w:p>
-      <w:pPr>
-        <w:pStyle w:val="FirstParagraph"/>
-      </w:pPr>
-      <w:r>
-        <w:t xml:space="preserve">The oncogenes carried on ecDNA are among the most potent drivers in cancer. In glioblastoma, EGFR is the most common ecDNA cargo, often in the EGFRvIII mutant form that signals constitutively. Other common ecDNA oncogenes include MYC, MYCN, CDK4, MDM2, and PDGFRA. Because ecDNA lack the heterochromatinization that silences many chromosomal amplifications, they are transcriptionally hyperactive. ecDNA-amplified oncogenes can be expressed at 10-100 fold higher levels than the same gene at normal copy number.</w:t>
-      </w:r>
-    </w:p>
-    <w:bookmarkEnd w:id="32"/>
-    <w:bookmarkStart w:id="33" w:name="causal-simulation-for-ecdna-expansion."/>
-    <w:p>
-      <w:pPr>
-        <w:pStyle w:val="Heading2"/>
-      </w:pPr>
-      <w:r>
-        <w:t xml:space="preserve">Causal Simulation for ecDNA expansion.</w:t>
-      </w:r>
-    </w:p>
-    <w:p>
-      <w:pPr>
-        <w:pStyle w:val="FirstParagraph"/>
-      </w:pPr>
-      <w:r>
-        <w:t xml:space="preserve">To validate causal inference methods, we developed CAUSANTA (Causal Analysis Using Somatic And Neighborhood Tissue Architecture), a simulation that generates synthetic tumor tissue with embedded, known causal structure. CAUSANTA implements a six-phase hourly loop. First, environment diffusion solves reaction-diffusion PDEs for oxygen, glucose, VEGF, and lactate with Neumann boundary conditions. Second, cell behaviors including division, apoptosis, migration, and state transitions execute in random order. Third, angiogenesis proceeds through VEGF-driven sprouting from existing vasculature. Fourth, immune cells infiltrate through chemokine-dependent recruitment. Fifth, necrotic cells undergo lysis and occupancy maps are updated. Sixth, the simulation writes TSV snapshots of cell states, environment fields, and lineage events. The simulation tracks nine cell types with distinct behaviors.</w:t>
-      </w:r>
-    </w:p>
-    <w:bookmarkEnd w:id="33"/>
-    <w:bookmarkStart w:id="34" w:name="X682c74a70df98564677e4f89f171eddc57c0f24"/>
+    <w:bookmarkStart w:id="32" w:name="X682c74a70df98564677e4f89f171eddc57c0f24"/>
     <w:p>
       <w:pPr>
         <w:pStyle w:val="Heading2"/>
@@ -5253,8 +5218,8 @@
         <w:t xml:space="preserve">We term this concept a Somatic Instrumental Variable (SIV): an instrument arising from stochastic somatic processes rather than germline variation or external randomization. The SIV framework reframes ecDNA heterogeneity from a complication of tumor biology into an analytical asset. The same copy number variation that makes tumors difficult to characterize becomes the source of quasi-exogenous variation that enables causal inference from observational spatial data.</w:t>
       </w:r>
     </w:p>
-    <w:bookmarkEnd w:id="34"/>
-    <w:bookmarkStart w:id="38" w:name="X10315793979aff3561608a55dee825304706082"/>
+    <w:bookmarkEnd w:id="32"/>
+    <w:bookmarkStart w:id="36" w:name="X10315793979aff3561608a55dee825304706082"/>
     <w:p>
       <w:pPr>
         <w:pStyle w:val="Heading2"/>
@@ -5268,7 +5233,7 @@
         <w:pStyle w:val="FirstParagraph"/>
       </w:pPr>
       <w:r>
-        <w:t xml:space="preserve">In CAUSANTA simulations, we track every cell division event, recording parent ecDNA count before division, the replicated pool size, and the allocation to each daughter. Analysis of 9,869 division events from a 300-hour simulation on a 6mm × 6mm domain confirms that segregation follows the expected binomial model (Figure 1A).</w:t>
+        <w:t xml:space="preserve">In CAUSANTA simulations, we track every cell division event, recording parent ecDNA count before division, the replicated pool size, and the allocation to each daughter. Analysis of 51,658 division events from a 300-hour simulation on a 6mm × 6mm domain confirms that segregation follows the expected binomial model (Figure 1A).</w:t>
       </w:r>
     </w:p>
     <w:p>
@@ -5288,18 +5253,18 @@
           <wp:inline>
             <wp:extent cx="5334000" cy="2222500"/>
             <wp:effectExtent b="0" l="0" r="0" t="0"/>
-            <wp:docPr descr="Figure 1. (A) ecDNA segregation follows a binomial distribution. Histogram of daughter ecDNA fractions across 9,869 division events from a 300-hour CAUSANTA simulation on a 6mm × 6mm domain. The distribution is centered on the expected mean of 0.5 (dashed red line), with the observed mean of 0.501 (solid blue line) not significantly different from 0.5 (bootstrap test p = 0.48). The variance of 0.0071 matches the theoretical prediction for Binomial(N, 0.5) segregation. This confirms that ecDNA partitioning during mitosis is random with respect to cell state, satisfying the independence assumption for instrumental variable validity." title="" id="36" name="Picture"/>
+            <wp:docPr descr="Figure 1. (A) ecDNA segregation follows a binomial distribution. Histogram of daughter ecDNA fractions across 51,658 division events from a 300-hour CAUSANTA simulation on a 6mm × 6mm domain. The distribution is centered on the expected mean of 0.5 (dashed red line), with the observed mean of 0.501 (solid blue line) not significantly different from 0.5 (bootstrap test p = 0.48). The variance of 0.0071 matches the theoretical prediction for Binomial(N, 0.5) segregation. This confirms that ecDNA partitioning during mitosis is random with respect to cell state, satisfying the independence assumption for instrumental variable validity." title="" id="34" name="Picture"/>
             <a:graphic>
               <a:graphicData uri="http://schemas.openxmlformats.org/drawingml/2006/picture">
                 <pic:pic>
                   <pic:nvPicPr>
-                    <pic:cNvPr descr="figures/figure1_segregation_firststage.png" id="37" name="Picture"/>
+                    <pic:cNvPr descr="figures/figure1_segregation_firststage.png" id="35" name="Picture"/>
                     <pic:cNvPicPr>
                       <a:picLocks noChangeArrowheads="1" noChangeAspect="1"/>
                     </pic:cNvPicPr>
                   </pic:nvPicPr>
                   <pic:blipFill>
-                    <a:blip r:embed="rId35"/>
+                    <a:blip r:embed="rId33"/>
                     <a:stretch>
                       <a:fillRect/>
                     </a:stretch>
@@ -5331,7 +5296,7 @@
         <w:pStyle w:val="ImageCaption"/>
       </w:pPr>
       <w:r>
-        <w:t xml:space="preserve">Figure 1. (A) ecDNA segregation follows a binomial distribution. Histogram of daughter ecDNA fractions across 9,869 division events from a 300-hour CAUSANTA simulation on a 6mm × 6mm domain. The distribution is centered on the expected mean of 0.5 (dashed red line), with the observed mean of 0.501 (solid blue line) not significantly different from 0.5 (bootstrap test p = 0.48). The variance of 0.0071 matches the theoretical prediction for Binomial(N, 0.5) segregation. This confirms that ecDNA partitioning during mitosis is random with respect to cell state, satisfying the independence assumption for instrumental variable validity.</w:t>
+        <w:t xml:space="preserve">Figure 1. (A) ecDNA segregation follows a binomial distribution. Histogram of daughter ecDNA fractions across 51,658 division events from a 300-hour CAUSANTA simulation on a 6mm × 6mm domain. The distribution is centered on the expected mean of 0.5 (dashed red line), with the observed mean of 0.501 (solid blue line) not significantly different from 0.5 (bootstrap test p = 0.48). The variance of 0.0071 matches the theoretical prediction for Binomial(N, 0.5) segregation. This confirms that ecDNA partitioning during mitosis is random with respect to cell state, satisfying the independence assumption for instrumental variable validity.</w:t>
       </w:r>
     </w:p>
     <w:p>
@@ -5350,8 +5315,8 @@
         <w:t xml:space="preserve">Replication fidelity during S phase was also consistent with model parameters. The mean replication ratio (post-S-phase to pre-S-phase copy number) was 1.94 (95% CI: 1.92-1.96), corresponding to a per-copy replication probability of 0.948. This matches the configured 95% fidelity parameter.</w:t>
       </w:r>
     </w:p>
-    <w:bookmarkEnd w:id="38"/>
-    <w:bookmarkStart w:id="39" w:name="X4ee4ad075170a4d258a5d3c93209e6ddbf2bc7b"/>
+    <w:bookmarkEnd w:id="36"/>
+    <w:bookmarkStart w:id="37" w:name="X4ee4ad075170a4d258a5d3c93209e6ddbf2bc7b"/>
     <w:p>
       <w:pPr>
         <w:pStyle w:val="Heading2"/>
@@ -5432,11 +5397,11 @@
         <w:pStyle w:val="FirstParagraph"/>
       </w:pPr>
       <w:r>
-        <w:t xml:space="preserve">The regression coefficient of 1.21 ± 0.005 indicates that each additional ecDNA copy adds 1.21 normalized expression units. This strong linear relationship explains 88.4% of the variance in EGFR expression (R² = 0.884) across 8,221 tumor cells at the final simulation timepoint (t = 300h). The high R² reflects the dominant gene dosage effect; the remaining variance is attributable to HIF-1α-mediated EGFR upregulation under hypoxia—precisely the confounding that IV methods correct. The first-stage F-statistic of 62,751 exceeds the Staiger-Stock weak-instrument threshold of 10 by more than 6,000-fold, confirming that ecDNA copy number is an exceptionally strong instrument despite the presence of confounding. This strength arises from the direct gene dosage mechanism: each ecDNA circle contains the EGFR locus, and transcription scales linearly with template number.</w:t>
-      </w:r>
-    </w:p>
-    <w:bookmarkEnd w:id="39"/>
-    <w:bookmarkStart w:id="43" w:name="causal-effect-recovery-iv-vs.-ols"/>
+        <w:t xml:space="preserve">The regression coefficient of 1.21 ± 0.005 indicates that each additional ecDNA copy adds 1.21 normalized expression units (in normoxic cells; hypoxic cells show a 2.5-fold upregulation via HIF-1α). This strong linear relationship explains 85.1% of the variance in EGFR expression (R² = 0.851) across 44,400 tumor cells at the final simulation timepoint (t = 300h). The high R² reflects the dominant gene dosage effect; the remaining variance is attributable to HIF-1α-mediated EGFR upregulation under hypoxia—precisely the confounding that IV methods correct. The first-stage F-statistic of 253,699 exceeds the Staiger-Stock weak-instrument threshold of 10 by more than 25,000-fold, confirming that ecDNA copy number is an exceptionally strong instrument despite the presence of confounding. This strength arises from the direct gene dosage mechanism: each ecDNA circle contains the EGFR locus, and transcription scales linearly with template number.</w:t>
+      </w:r>
+    </w:p>
+    <w:bookmarkEnd w:id="37"/>
+    <w:bookmarkStart w:id="41" w:name="causal-effect-recovery-iv-vs.-ols"/>
     <w:p>
       <w:pPr>
         <w:pStyle w:val="Heading2"/>
@@ -5462,18 +5427,18 @@
           <wp:inline>
             <wp:extent cx="5334000" cy="3556000"/>
             <wp:effectExtent b="0" l="0" r="0" t="0"/>
-            <wp:docPr descr="Figure 2. Forest plot comparing ordinary least squares (OLS, red circles) and instrumental variable (IV, blue squares) estimates for the VEGF secretion (β) and migration (δ) causal parameters embedded in the simulation. Error bars indicate 95% confidence intervals. Vertical dashed green lines indicate ground-truth values configured in the simulation. OLS estimates are systematically biased upward due to confounding by hypoxia, which independently affects both EGFR expression and cellular phenotypes through HIF-1α signaling. The bias is most severe for the VEGF effect β, where OLS overestimates the true effect by 117% (OLS: 0.22 vs. ground truth: 0.10). IV estimates recover the true causal effects with minimal bias." title="" id="41" name="Picture"/>
+            <wp:docPr descr="Figure 2. Forest plot comparing ordinary least squares (OLS, red circles) and instrumental variable (IV, blue squares) estimates for the VEGF secretion (β) and migration (δ) causal parameters embedded in the simulation. Error bars indicate 95% confidence intervals. Vertical dashed green lines indicate ground-truth values configured in the simulation. OLS estimates are systematically biased upward due to confounding by hypoxia, which independently affects both EGFR expression and cellular phenotypes through HIF-1α signaling. The bias is most severe for the VEGF effect β, where OLS overestimates the true effect by 117% (OLS: 0.22 vs. ground truth: 0.10). IV estimates recover the true causal effects with minimal bias." title="" id="39" name="Picture"/>
             <a:graphic>
               <a:graphicData uri="http://schemas.openxmlformats.org/drawingml/2006/picture">
                 <pic:pic>
                   <pic:nvPicPr>
-                    <pic:cNvPr descr="figures/figure2_ols_vs_iv.png" id="42" name="Picture"/>
+                    <pic:cNvPr descr="figures/figure2_ols_vs_iv.png" id="40" name="Picture"/>
                     <pic:cNvPicPr>
                       <a:picLocks noChangeArrowheads="1" noChangeAspect="1"/>
                     </pic:cNvPicPr>
                   </pic:nvPicPr>
                   <pic:blipFill>
-                    <a:blip r:embed="rId40"/>
+                    <a:blip r:embed="rId38"/>
                     <a:stretch>
                       <a:fillRect/>
                     </a:stretch>
@@ -5544,8 +5509,8 @@
         <w:t xml:space="preserve">phenotype: hypoxia independently increases migration speed by 2-fold (ψ = 2.0), but the effect is moderated by the weaker correlation between hypoxia and EGFR at the margin. IV standard errors are larger than OLS, which is expected because IV uses only the variation in EGFR attributable to the random instrument, discarding the confounded variation from other sources. The efficiency cost is modest and is far outweighed by the bias correction.</w:t>
       </w:r>
     </w:p>
-    <w:bookmarkEnd w:id="43"/>
-    <w:bookmarkStart w:id="44" w:name="Xa547553ca6c4346c957c0496e93f5f1f6d0492e"/>
+    <w:bookmarkEnd w:id="41"/>
+    <w:bookmarkStart w:id="42" w:name="Xa547553ca6c4346c957c0496e93f5f1f6d0492e"/>
     <w:p>
       <w:pPr>
         <w:pStyle w:val="Heading2"/>
@@ -5743,8 +5708,8 @@
         <w:t xml:space="preserve">The concordance between sibling estimates, IV estimates, and ground truth provides independent validation that the causal effects are correctly identified. The sibling design has the additional advantage of controlling for all shared confounders, including unobserved ones, strengthening confidence in the exclusion restriction.</w:t>
       </w:r>
     </w:p>
-    <w:bookmarkEnd w:id="44"/>
-    <w:bookmarkStart w:id="45" w:name="X4774da5c31caa574f10977d41b7f0c491ed8296"/>
+    <w:bookmarkEnd w:id="42"/>
+    <w:bookmarkStart w:id="43" w:name="X4774da5c31caa574f10977d41b7f0c491ed8296"/>
     <w:p>
       <w:pPr>
         <w:pStyle w:val="Heading2"/>
@@ -5758,7 +5723,7 @@
         <w:pStyle w:val="FirstParagraph"/>
       </w:pPr>
       <w:r>
-        <w:t xml:space="preserve">Beyond estimating pre-specified effects, we test whether causal discovery algorithms can recover the ground-truth DAG from simulation data (Figure 1). We apply the PC algorithm with significance level α = 0.05 and maximum conditioning set size k = 3.</w:t>
+        <w:t xml:space="preserve">Beyond estimating pre-specified effects, we test whether causal discovery algorithms can recover the ground-truth DAG from simulation data (Figure 3). We apply the PC algorithm with significance level α = 0.05 and maximum conditioning set size k = 3.</w:t>
       </w:r>
     </w:p>
     <w:p>
@@ -5774,7 +5739,7 @@
         <w:pStyle w:val="BodyText"/>
       </w:pPr>
       <w:r>
-        <w:t xml:space="preserve">Overall performance showed a Structural Hamming Distance of 4, precision of 0.60, recall of 0.60, and F1 score of 0.60. The algorithm correctly identifies that ecDNA causes EGFR expression (not the reverse) and that EGFR causes downstream phenotypes. Importantly, it correctly excludes direct ecDNA → Phenotype edges, which would violate the exclusion restriction. The errors (SHD = 4) involve edge orientation ambiguities and missing confounding paths, not structural</w:t>
+        <w:t xml:space="preserve">Overall performance showed a Structural Hamming Distance of 4, precision of 0.60, recall of 0.60, and F1 score of 0.60. The algorithm correctly identifies that ecDNA causes EGFR expression (not the reverse) and that EGFR causes downstream phenotypes. Importantly, it correctly excludes direct ecDNA → Phenotype edges, which would violate the exclusion restriction. The errors (SHD = 4) involve edge orientation ambiguities and missing confounding paths, not structural errors in the skeleton.</w:t>
       </w:r>
     </w:p>
     <w:p>
@@ -5803,7 +5768,7 @@
         <w:rPr>
           <w:rStyle w:val="VerbatimChar"/>
         </w:rPr>
-        <w:t xml:space="preserve">                              │ gene dosage (κ=0.5)</w:t>
+        <w:t xml:space="preserve">                              │ gene dosage (κ=1.21)</w:t>
       </w:r>
       <w:r>
         <w:br/>
@@ -5972,19 +5937,57 @@
         <w:pStyle w:val="BodyText"/>
       </w:pPr>
       <w:r>
-        <w:t xml:space="preserve">Instrument pathway: ecDNA copy number (Z) directly determines EGFR expression (X) through gene dosage. This relationship is the basis for instrument relevance. Causal effectsEGFR expression causally affects four downstream phenotypes: proliferation rate, migration speed, VEGF secretion, and cell survival. These are the causal parameters (α, β, δ, γ) that IV methods aim to estimate. Confounding paths (Local oxygen concentration (O2) determines hypoxia status, which independently affects proliferation (via cell cycle arrest), migration (via Go-or-Grow switch), and VEGF secretion (via HIF-1α stabilization). These pathways create confounding that biases naive regression estimates. Critically, oxygen cannot influence ecDNA segregation because partitioning occurs via physical mechanisms during cytokinesis that are independent of the microenvironment.</w:t>
-      </w:r>
-    </w:p>
-    <w:p>
-      <w:pPr>
-        <w:pStyle w:val="BodyText"/>
-      </w:pPr>
-      <w:r>
-        <w:t xml:space="preserve">errors in the skeleton.</w:t>
-      </w:r>
-    </w:p>
-    <w:bookmarkEnd w:id="45"/>
-    <w:bookmarkStart w:id="49" w:name="Xabcc6d9f15d85681730f764856a0169e28b8d7f"/>
+        <w:rPr>
+          <w:b/>
+          <w:bCs/>
+        </w:rPr>
+        <w:t xml:space="preserve">Instrument pathway:</w:t>
+      </w:r>
+      <w:r>
+        <w:t xml:space="preserve"> </w:t>
+      </w:r>
+      <w:r>
+        <w:t xml:space="preserve">ecDNA copy number (Z) directly determines EGFR expression (X) through gene dosage. This relationship is the basis for instrument relevance.</w:t>
+      </w:r>
+    </w:p>
+    <w:p>
+      <w:pPr>
+        <w:pStyle w:val="BodyText"/>
+      </w:pPr>
+      <w:r>
+        <w:rPr>
+          <w:b/>
+          <w:bCs/>
+        </w:rPr>
+        <w:t xml:space="preserve">Causal effects:</w:t>
+      </w:r>
+      <w:r>
+        <w:t xml:space="preserve"> </w:t>
+      </w:r>
+      <w:r>
+        <w:t xml:space="preserve">EGFR expression causally affects four downstream phenotypes: proliferation rate, migration speed, VEGF secretion, and cell survival. These are the causal parameters (α, β, δ, γ) that IV methods aim to estimate.</w:t>
+      </w:r>
+    </w:p>
+    <w:p>
+      <w:pPr>
+        <w:pStyle w:val="BodyText"/>
+      </w:pPr>
+      <w:r>
+        <w:rPr>
+          <w:b/>
+          <w:bCs/>
+        </w:rPr>
+        <w:t xml:space="preserve">Confounding paths:</w:t>
+      </w:r>
+      <w:r>
+        <w:t xml:space="preserve"> </w:t>
+      </w:r>
+      <w:r>
+        <w:t xml:space="preserve">Local oxygen concentration (O2) determines hypoxia status, which independently affects proliferation (via cell cycle arrest), migration (via Go-or-Grow switch), and VEGF secretion (via HIF-1α stabilization). These pathways create confounding that biases naive regression estimates. Critically, oxygen cannot influence ecDNA segregation because partitioning occurs via physical mechanisms during cytokinesis that are independent of the microenvironment.</w:t>
+      </w:r>
+    </w:p>
+    <w:bookmarkEnd w:id="43"/>
+    <w:bookmarkStart w:id="47" w:name="Xabcc6d9f15d85681730f764856a0169e28b8d7f"/>
     <w:p>
       <w:pPr>
         <w:pStyle w:val="Heading2"/>
@@ -6026,18 +6029,18 @@
           <wp:inline>
             <wp:extent cx="5334000" cy="2222500"/>
             <wp:effectExtent b="0" l="0" r="0" t="0"/>
-            <wp:docPr descr="Figure 4. Sensitivity Analysis for Unmeasured Confounding (A) Rosenbaum bounds. Plot showing how the upper-bound p-value for each IV estimate changes as a function of the confounding parameter Γ. The critical Γ (Γ) is the smallest value at which the p-value upper bound exceeds 0.05 (horizontal red line). For both the migration effect δ and VEGF effect β, Γ exceeds 30 (off-scale), indicating extreme robustness to unmeasured confounding. This reflects the fundamental randomness of ecDNA segregation—no biological mechanism could plausibly confound the instrument at such magnitudes. (B) E-values. Bar chart showing E-values for point estimates and confidence interval bounds. The E-value represents the minimum strength of association (risk ratio) that an unmeasured confounder would need with both ecDNA and the outcome to fully explain away the observed effect. For the migration effect δ, the point estimate E-value is 4.6 and the CI bound E-value is 4.5. For VEGF effect β, values are 13.4 and 11.7 respectively—reflecting the strong IV estimate for VEGF secretion. No known biological mechanism links ecDNA segregation to microenvironmental variables at these magnitudes." title="" id="47" name="Picture"/>
+            <wp:docPr descr="Figure 4. Sensitivity Analysis for Unmeasured Confounding (A) Rosenbaum bounds. Plot showing how the upper-bound p-value for each IV estimate changes as a function of the confounding parameter Γ. The critical Γ (Γ) is the smallest value at which the p-value upper bound exceeds 0.05 (horizontal red line). For both the migration effect δ and VEGF effect β, Γ exceeds 30 (off-scale), indicating extreme robustness to unmeasured confounding. This reflects the fundamental randomness of ecDNA segregation—no biological mechanism could plausibly confound the instrument at such magnitudes. (B) E-values. Bar chart showing E-values for point estimates and confidence interval bounds. The E-value represents the minimum strength of association (risk ratio) that an unmeasured confounder would need with both ecDNA and the outcome to fully explain away the observed effect. For the migration effect δ, the point estimate E-value is 4.6 and the CI bound E-value is 4.5. For VEGF effect β, values are 13.4 and 11.7 respectively—reflecting the strong IV estimate for VEGF secretion. No known biological mechanism links ecDNA segregation to microenvironmental variables at these magnitudes." title="" id="45" name="Picture"/>
             <a:graphic>
               <a:graphicData uri="http://schemas.openxmlformats.org/drawingml/2006/picture">
                 <pic:pic>
                   <pic:nvPicPr>
-                    <pic:cNvPr descr="figures/figure4_sensitivity.png" id="48" name="Picture"/>
+                    <pic:cNvPr descr="figures/figure4_sensitivity.png" id="46" name="Picture"/>
                     <pic:cNvPicPr>
                       <a:picLocks noChangeArrowheads="1" noChangeAspect="1"/>
                     </pic:cNvPicPr>
                   </pic:nvPicPr>
                   <pic:blipFill>
-                    <a:blip r:embed="rId46"/>
+                    <a:blip r:embed="rId44"/>
                     <a:stretch>
                       <a:fillRect/>
                     </a:stretch>
@@ -6101,14 +6104,57 @@
         <w:t xml:space="preserve">Placebo tests assess whether ecDNA predicts outcomes that should not be causally affected. ecDNA copy number showed no significant association with cell x-coordinate (coefficient 0.002, p = 0.81), cell y-coordinate (coefficient -0.001, p = 0.89), or distance from tumor center (coefficient 0.008, p = 0.34). The absence of these associations confirms that the instrument is not confounded by unmeasured spatial variables.</w:t>
       </w:r>
     </w:p>
+    <w:bookmarkEnd w:id="47"/>
+    <w:bookmarkStart w:id="48" w:name="spatial-heterogeneity-of-causal-effects"/>
+    <w:p>
+      <w:pPr>
+        <w:pStyle w:val="Heading2"/>
+      </w:pPr>
+      <w:r>
+        <w:t xml:space="preserve">Spatial Heterogeneity of Causal Effects</w:t>
+      </w:r>
+    </w:p>
+    <w:p>
+      <w:pPr>
+        <w:pStyle w:val="FirstParagraph"/>
+      </w:pPr>
+      <w:r>
+        <w:t xml:space="preserve">A unique advantage of spatial causal inference is the ability to map how causal effects vary across tissue regions (Figure 5). We stratify the tumor into three zones and estimate the migration effect δ separately in each.</w:t>
+      </w:r>
+    </w:p>
+    <w:p>
+      <w:pPr>
+        <w:pStyle w:val="BodyText"/>
+      </w:pPr>
+      <w:r>
+        <w:t xml:space="preserve">In the tumor core, defined as cells more than 100 μm from the margin (n = 1,247 cells), the EGFR effect on migration was modest at δ = 0.03 ± 0.02 (95% CI: 0.01-0.05). At the invasive margin, defined as cells within 100 μm of the tumor boundary (n = 823 cells), the effect was substantially stronger at δ = 0.07 ± 0.02 (95% CI: 0.05-0.09). Among infiltrating cells that had crossed beyond the original tumor boundary (n = 412 cells), the effect was intermediate at δ = 0.04 ± 0.03 (95% CI: 0.01-0.07).</w:t>
+      </w:r>
+    </w:p>
+    <w:p>
+      <w:pPr>
+        <w:pStyle w:val="BodyText"/>
+      </w:pPr>
+      <w:r>
+        <w:t xml:space="preserve">This spatial heterogeneity has biological plausibility. Core cells are constrained by high cell density and contact inhibition, limiting the phenotypic impact of EGFR-driven motility programs. Margin cells have space to migrate and face strong selective pressure for invasion, amplifying the EGFR effect. Infiltrating cells have already migrated, and EGFR may be less rate-limiting once invasion has occurred.</w:t>
+      </w:r>
+    </w:p>
+    <w:p>
+      <w:pPr>
+        <w:pStyle w:val="BodyText"/>
+      </w:pPr>
+      <w:r>
+        <w:t xml:space="preserve">This pattern would be masked in bulk analyses but is revealed by spatially resolved causal inference. The finding suggests that EGFR-targeted therapy might have the greatest impact on invasion when delivered to the tumor margin.</w:t>
+      </w:r>
+    </w:p>
+    <w:bookmarkEnd w:id="48"/>
     <w:bookmarkEnd w:id="49"/>
-    <w:bookmarkStart w:id="50" w:name="spatial-heterogeneity-of-causal-effects"/>
-    <w:p>
-      <w:pPr>
-        <w:pStyle w:val="Heading2"/>
-      </w:pPr>
-      <w:r>
-        <w:t xml:space="preserve">Spatial Heterogeneity of Causal Effects</w:t>
+    <w:bookmarkStart w:id="60" w:name="discussion"/>
+    <w:p>
+      <w:pPr>
+        <w:pStyle w:val="Heading1"/>
+      </w:pPr>
+      <w:r>
+        <w:t xml:space="preserve">Discussion</w:t>
       </w:r>
     </w:p>
     <w:p>
@@ -6116,49 +6162,6 @@
         <w:pStyle w:val="FirstParagraph"/>
       </w:pPr>
       <w:r>
-        <w:t xml:space="preserve">A unique advantage of spatial causal inference is the ability to map how causal effects vary across tissue regions (Figure 4). We stratify the tumor into three zones and estimate the migration effect δ separately in each.</w:t>
-      </w:r>
-    </w:p>
-    <w:p>
-      <w:pPr>
-        <w:pStyle w:val="BodyText"/>
-      </w:pPr>
-      <w:r>
-        <w:t xml:space="preserve">In the tumor core, defined as cells more than 100 μm from the margin (n = 1,247 cells), the EGFR effect on migration was modest at δ = 0.03 ± 0.02 (95% CI: 0.01-0.05). At the invasive margin, defined as cells within 100 μm of the tumor boundary (n = 823 cells), the effect was substantially stronger at δ = 0.07 ± 0.02 (95% CI: 0.05-0.09). Among infiltrating cells that had crossed beyond the original tumor boundary (n = 412 cells), the effect was intermediate at δ = 0.04 ± 0.03 (95% CI: 0.01-0.07).</w:t>
-      </w:r>
-    </w:p>
-    <w:p>
-      <w:pPr>
-        <w:pStyle w:val="BodyText"/>
-      </w:pPr>
-      <w:r>
-        <w:t xml:space="preserve">This spatial heterogeneity has biological plausibility. Core cells are constrained by high cell density and contact inhibition, limiting the phenotypic impact of EGFR-driven motility programs. Margin cells have space to migrate and face strong selective pressure for invasion, amplifying the EGFR effect. Infiltrating cells have already migrated, and EGFR may be less rate-limiting once invasion has occurred.</w:t>
-      </w:r>
-    </w:p>
-    <w:p>
-      <w:pPr>
-        <w:pStyle w:val="BodyText"/>
-      </w:pPr>
-      <w:r>
-        <w:t xml:space="preserve">This pattern would be masked in bulk analyses but is revealed by spatially resolved causal inference. The finding suggests that EGFR-targeted therapy might have the greatest impact on invasion when delivered to the tumor margin.</w:t>
-      </w:r>
-    </w:p>
-    <w:bookmarkEnd w:id="50"/>
-    <w:bookmarkEnd w:id="51"/>
-    <w:bookmarkStart w:id="62" w:name="discussion"/>
-    <w:p>
-      <w:pPr>
-        <w:pStyle w:val="Heading1"/>
-      </w:pPr>
-      <w:r>
-        <w:t xml:space="preserve">Discussion</w:t>
-      </w:r>
-    </w:p>
-    <w:p>
-      <w:pPr>
-        <w:pStyle w:val="FirstParagraph"/>
-      </w:pPr>
-      <w:r>
         <w:t xml:space="preserve">This work establishes a rigorous framework for causal inference in spatial multi-omics by exploiting the stochastic segregation of extrachromosomal DNA. The theoretical foundation rests on formalizing ecDNA copy number as a Somatic Instrumental Variable (SIV). Random mitotic segregation, governed by physical partitioning during cytokinesis rather than any biological program, satisfies the three conditions for valid causal identification: relevance through gene dosage, independence through binomial segregation, and exclusion through gene expression mediating all phenotypic effects. This provides a principled basis for causal inference in settings where experimental manipulation is impossible.</w:t>
       </w:r>
     </w:p>
@@ -6186,7 +6189,7 @@
         <w:t xml:space="preserve">Critically, the causal model not only provides a correction mechanism but also makes testable predictions. Given the confounding structure—hypoxia independently increasing both EGFR expression (via HIF-1α) and phenotypic outcomes (via HIF-1α and Go-or-Grow)—the model predicts that OLS will overestimate causal effects (positive bias). Our simulations confirm this prediction: IV methods recover true causal effects within approximately 10% error (relative bias &lt; 0.1), while naive OLS regression is biased by 27-117% due to microenvironmental confounding. This is not a small correction. For the VEGF secretion effect β, OLS overestimates by more than 2-fold, and the bias is systematic, positive, and would lead to incorrect predictions about therapeutic interventions. IV methods eliminate this bias.</w:t>
       </w:r>
     </w:p>
-    <w:bookmarkStart w:id="55" w:name="X8efe33ac364d19e2cfb97c1f6081be4d0fcdd9a"/>
+    <w:bookmarkStart w:id="53" w:name="X8efe33ac364d19e2cfb97c1f6081be4d0fcdd9a"/>
     <w:p>
       <w:pPr>
         <w:pStyle w:val="Heading2"/>
@@ -6212,18 +6215,18 @@
           <wp:inline>
             <wp:extent cx="5334000" cy="2222500"/>
             <wp:effectExtent b="0" l="0" r="0" t="0"/>
-            <wp:docPr descr="Figure 5. Spatial Heterogeneity of Causal Effects (A) Spatial distribution of ecDNA copy number. Scatter plot showing the spatial positions of 8,221 tumor cells at the final simulation timepoint (t = 300h) on a 6mm × 6mm domain. Cells are colored by ecDNA copy number (color scale: blue = low, red = high). The tumor originated from three seed cells at positions (3000, 3000), (2700, 2700), and (3300, 3300) and expanded outward. ecDNA copy number varies substantially across the tumor population due to stochastic segregation, creating the within-tumor variation that enables causal inference. (B) Regional variation in EGFR effect on migration. Bar chart comparing the estimated causal effect of EGFR on migration (δ) across three tumor regions. The invasive margin shows the strongest effect (δ = 0.07, 95% CI: 0.05-0.09), approximately 2-fold higher than the tumor core (δ = 0.03, 95% CI: 0.01-0.05). Infiltrating cells beyond the original tumor boundary show an intermediate effect (δ = 0.04, 95% CI: 0.01-0.07). This spatial heterogeneity has biological plausibility: core cells are constrained by high cell density and contact inhibition, limiting the phenotypic impact of EGFR-driven motility programs; margin cells have space to migrate and face selective pressure for invasion, amplifying the EGFR effect; infiltrating cells have already completed migration, and EGFR may be less rate-limiting once invasion has occurred. The dashed red line indicates the overall δ estimate of 0.05. This pattern would be masked in bulk analyses but is revealed by spatially resolved causal inference, suggesting that EGFR-targeted therapy might have the greatest impact on invasion when delivered to the tumor margin." title="" id="53" name="Picture"/>
+            <wp:docPr descr="Figure 5. Spatial Heterogeneity of Causal Effects (A) Spatial distribution of ecDNA copy number. Scatter plot showing the spatial positions of 8,221 tumor cells at the final simulation timepoint (t = 300h) on a 6mm × 6mm domain. Cells are colored by ecDNA copy number (color scale: blue = low, red = high). The tumor originated from three seed cells at positions (3000, 3000), (2700, 2700), and (3300, 3300) and expanded outward. ecDNA copy number varies substantially across the tumor population due to stochastic segregation, creating the within-tumor variation that enables causal inference. (B) Regional variation in EGFR effect on migration. Bar chart comparing the estimated causal effect of EGFR on migration (δ) across three tumor regions. The invasive margin shows the strongest effect (δ = 0.07, 95% CI: 0.05-0.09), approximately 2-fold higher than the tumor core (δ = 0.03, 95% CI: 0.01-0.05). Infiltrating cells beyond the original tumor boundary show an intermediate effect (δ = 0.04, 95% CI: 0.01-0.07). This spatial heterogeneity has biological plausibility: core cells are constrained by high cell density and contact inhibition, limiting the phenotypic impact of EGFR-driven motility programs; margin cells have space to migrate and face selective pressure for invasion, amplifying the EGFR effect; infiltrating cells have already completed migration, and EGFR may be less rate-limiting once invasion has occurred. The dashed red line indicates the overall δ estimate of 0.05. This pattern would be masked in bulk analyses but is revealed by spatially resolved causal inference, suggesting that EGFR-targeted therapy might have the greatest impact on invasion when delivered to the tumor margin." title="" id="51" name="Picture"/>
             <a:graphic>
               <a:graphicData uri="http://schemas.openxmlformats.org/drawingml/2006/picture">
                 <pic:pic>
                   <pic:nvPicPr>
-                    <pic:cNvPr descr="figures/figure5_spatial_heterogeneity.png" id="54" name="Picture"/>
+                    <pic:cNvPr descr="figures/figure5_spatial_heterogeneity.png" id="52" name="Picture"/>
                     <pic:cNvPicPr>
                       <a:picLocks noChangeArrowheads="1" noChangeAspect="1"/>
                     </pic:cNvPicPr>
                   </pic:nvPicPr>
                   <pic:blipFill>
-                    <a:blip r:embed="rId52"/>
+                    <a:blip r:embed="rId50"/>
                     <a:stretch>
                       <a:fillRect/>
                     </a:stretch>
@@ -6266,14 +6269,90 @@
         <w:t xml:space="preserve">The framework also enables construction of spatial maps showing where causal effects are strongest. Our finding that EGFR’s effect on migration peaks at the invasive margin (δ_margin = 0.07 vs. δ_core = 0.03) has direct therapeutic implications. If the goal is to reduce invasion, EGFR-targeted therapy may be most effective when delivered to the margin rather than the core. Conversely, therapies targeting proliferation may be more effective in the core where EGFR drives cell cycle progression.</w:t>
       </w:r>
     </w:p>
+    <w:bookmarkEnd w:id="53"/>
+    <w:bookmarkStart w:id="54" w:name="X9f4e940d8c13e44f5222b4cc8061cbeba010f3e"/>
+    <w:p>
+      <w:pPr>
+        <w:pStyle w:val="Heading2"/>
+      </w:pPr>
+      <w:r>
+        <w:t xml:space="preserve">Multi-Instrument Extensions: Factorial Designs within a Single Tumor</w:t>
+      </w:r>
+    </w:p>
+    <w:p>
+      <w:pPr>
+        <w:pStyle w:val="FirstParagraph"/>
+      </w:pPr>
+      <w:r>
+        <w:t xml:space="preserve">Many tumors harbor multiple independent ecDNA species, each carrying different oncogenes. In glioblastoma, combinations of EGFR, PDGFRA, CDK4, MDM2, and MYC amplifications are common. Because each ecDNA species segregates independently during mitosis, their copy numbers are approximately uncorrelated within the tumor population. This creates a natural factorial design:</w:t>
+      </w:r>
+    </w:p>
+    <w:p>
+      <w:pPr>
+        <w:pStyle w:val="BodyText"/>
+      </w:pPr>
+      <w:r>
+        <w:t xml:space="preserve">Multi-instrument IV methods allow estimation of the independent causal effect of EGFR (using MYC-ecDNA as a negative control), the independent causal effect of MYC (using EGFR-ecDNA as a negative control), and the interaction effect between EGFR and MYC. This is analogous to a 2×2 factorial experiment occurring naturally within the tumor through stochastic segregation. The sample sizes are typically adequate: a tumor with 10,000 cells and moderate ecDNA prevalence will have hundreds of cells in each factorial quadrant.</w:t>
+      </w:r>
+    </w:p>
+    <w:bookmarkEnd w:id="54"/>
+    <w:bookmarkStart w:id="55" w:name="X03c980d621165286d6d9571d4353a547bd63830"/>
+    <w:p>
+      <w:pPr>
+        <w:pStyle w:val="Heading2"/>
+      </w:pPr>
+      <w:r>
+        <w:t xml:space="preserve">Generalization: Other Somatic Instrumental Variables</w:t>
+      </w:r>
+    </w:p>
+    <w:p>
+      <w:pPr>
+        <w:pStyle w:val="FirstParagraph"/>
+      </w:pPr>
+      <w:r>
+        <w:t xml:space="preserve">The SIV concept extends beyond ecDNA to other forms of heritable somatic mosaicism. Mitochondrial heteroplasmy provides one example: mtDNA lacks the tight segregation control of nuclear DNA and partitions stochastically during cell division, creating within-lineage variation in mtDNA genotype and mitochondrial function. For cells carrying a heteroplasmic pathogenic mutation, the mutation load varies randomly across siblings, providing an instrument for causal effects of mitochondrial dysfunction on cell metabolism, ROS production, and apoptosis.</w:t>
+      </w:r>
+    </w:p>
+    <w:p>
+      <w:pPr>
+        <w:pStyle w:val="BodyText"/>
+      </w:pPr>
+      <w:r>
+        <w:t xml:space="preserve">Chromosomal instability (CIN) offers another possibility. Aneuploid tumors show ongoing chromosome missegregation, creating random variation in chromosome copy number across divisions. While noisier than ecDNA segregation, CIN could provide instruments for gene dosage effects of entire chromosome arms.</w:t>
+      </w:r>
+    </w:p>
+    <w:p>
+      <w:pPr>
+        <w:pStyle w:val="BodyText"/>
+      </w:pPr>
+      <w:r>
+        <w:t xml:space="preserve">Loss of heterozygosity (LOH) events are irreversible and mark clonal ancestry. The presence or absence of LOH at a specific locus provides a binary instrument for effects of allele-specific expression or haploinsufficiency, and the timing of LOH provides time-ordering information that aids causal discovery.</w:t>
+      </w:r>
+    </w:p>
+    <w:p>
+      <w:pPr>
+        <w:pStyle w:val="BodyText"/>
+      </w:pPr>
+      <w:r>
+        <w:t xml:space="preserve">Epigenetic drift represents yet another source of stochastic variation. Stochastic changes in DNA methylation at metastable epialleles create heritable variation in gene silencing. Recent work has shown that methylation patterns can serve as lineage markers, and the same logic suggests they could serve as instruments for effects of gene silencing.</w:t>
+      </w:r>
+    </w:p>
+    <w:p>
+      <w:pPr>
+        <w:pStyle w:val="BodyText"/>
+      </w:pPr>
+      <w:r>
+        <w:t xml:space="preserve">The general principle is that any source of cell-to-cell variation that is heritable across divisions, independent of microenvironmental confounders, and affects gene expression or function can serve as a somatic instrumental variable.</w:t>
+      </w:r>
+    </w:p>
     <w:bookmarkEnd w:id="55"/>
-    <w:bookmarkStart w:id="56" w:name="X9f4e940d8c13e44f5222b4cc8061cbeba010f3e"/>
+    <w:bookmarkStart w:id="56" w:name="relation-to-prior-work"/>
     <w:p>
       <w:pPr>
         <w:pStyle w:val="Heading2"/>
       </w:pPr>
       <w:r>
-        <w:t xml:space="preserve">Multi-Instrument Extensions: Factorial Designs within a Single Tumor</w:t>
+        <w:t xml:space="preserve">Relation to Prior Work</w:t>
       </w:r>
     </w:p>
     <w:p>
@@ -6281,25 +6360,33 @@
         <w:pStyle w:val="FirstParagraph"/>
       </w:pPr>
       <w:r>
-        <w:t xml:space="preserve">Many tumors harbor multiple independent ecDNA species, each carrying different oncogenes. In glioblastoma, combinations of EGFR, PDGFRA, CDK4, MDM2, and MYC amplifications are common. Because each ecDNA species segregates independently during mitosis, their copy numbers are approximately uncorrelated within the tumor population. This creates a natural factorial design:</w:t>
-      </w:r>
-    </w:p>
-    <w:p>
-      <w:pPr>
-        <w:pStyle w:val="BodyText"/>
-      </w:pPr>
-      <w:r>
-        <w:t xml:space="preserve">Multi-instrument IV methods allow estimation of the independent causal effect of EGFR (using MYC-ecDNA as a negative control), the independent causal effect of MYC (using EGFR-ecDNA as a negative control), and the interaction effect between EGFR and MYC. This is analogous to a 2×2 factorial experiment occurring naturally within the tumor through stochastic segregation. The sample sizes are typically adequate: a tumor with 10,000 cells and moderate ecDNA prevalence will have hundreds of cells in each factorial quadrant.</w:t>
+        <w:t xml:space="preserve">The SIV framework builds on three intellectual traditions. The IV methodology was developed by economists to address confounding in observational studies of policy effects (Angrist &amp; Pischke, 2009). Classic instruments include distance to college or hospital, lottery outcomes such as the draft lottery or school assignment, and weather shocks. Our contribution is identifying a biological process, ecDNA segregation, that satisfies the same logical conditions.</w:t>
+      </w:r>
+    </w:p>
+    <w:p>
+      <w:pPr>
+        <w:pStyle w:val="BodyText"/>
+      </w:pPr>
+      <w:r>
+        <w:t xml:space="preserve">The use of genetic variants as instruments for modifiable exposures, known as Mendelian randomization, has transformed epidemiology (Davey Smith &amp; Hemani, 2014). However, germline variants are constant across all cells in an individual, providing no within-tumor variation. The SIV concept extends Mendelian randomization to the somatic setting, exploiting within-tumor genetic variation created by mitotic segregation.</w:t>
+      </w:r>
+    </w:p>
+    <w:p>
+      <w:pPr>
+        <w:pStyle w:val="BodyText"/>
+      </w:pPr>
+      <w:r>
+        <w:t xml:space="preserve">Recent work has begun to address causality in spatial omics, including the use of perturbation data to validate spatial correlations and the development of causal discovery algorithms for spatial graphs. Our contribution is identifying a natural experiment, ecDNA segregation, that enables causal inference without perturbation, directly from observational spatial data.</w:t>
       </w:r>
     </w:p>
     <w:bookmarkEnd w:id="56"/>
-    <w:bookmarkStart w:id="57" w:name="X03c980d621165286d6d9571d4353a547bd63830"/>
+    <w:bookmarkStart w:id="57" w:name="limitations-and-assumptions"/>
     <w:p>
       <w:pPr>
         <w:pStyle w:val="Heading2"/>
       </w:pPr>
       <w:r>
-        <w:t xml:space="preserve">Generalization: Other Somatic Instrumental Variables</w:t>
+        <w:t xml:space="preserve">Limitations and Assumptions</w:t>
       </w:r>
     </w:p>
     <w:p>
@@ -6307,49 +6394,41 @@
         <w:pStyle w:val="FirstParagraph"/>
       </w:pPr>
       <w:r>
-        <w:t xml:space="preserve">The SIV concept extends beyond ecDNA to other forms of heritable somatic mosaicism. Mitochondrial heteroplasmy provides one example: mtDNA lacks the tight segregation control of nuclear DNA and partitions stochastically during cell division, creating within-lineage variation in mtDNA genotype and mitochondrial function. For cells carrying a heteroplasmic pathogenic mutation, the mutation load varies randomly across siblings, providing an instrument for causal effects of mitochondrial dysfunction on cell metabolism, ROS production, and apoptosis.</w:t>
-      </w:r>
-    </w:p>
-    <w:p>
-      <w:pPr>
-        <w:pStyle w:val="BodyText"/>
-      </w:pPr>
-      <w:r>
-        <w:t xml:space="preserve">Chromosomal instability (CIN) offers another possibility. Aneuploid tumors show ongoing chromosome missegregation, creating random variation in chromosome copy number across divisions. While noisier than ecDNA segregation, CIN could provide instruments for gene dosage effects of entire chromosome arms.</w:t>
-      </w:r>
-    </w:p>
-    <w:p>
-      <w:pPr>
-        <w:pStyle w:val="BodyText"/>
-      </w:pPr>
-      <w:r>
-        <w:t xml:space="preserve">Loss of heterozygosity (LOH) events are irreversible and mark clonal ancestry. The presence or absence of LOH at a specific locus provides a binary instrument for effects of allele-specific expression or haploinsufficiency, and the timing of LOH provides time-ordering information that aids causal discovery.</w:t>
-      </w:r>
-    </w:p>
-    <w:p>
-      <w:pPr>
-        <w:pStyle w:val="BodyText"/>
-      </w:pPr>
-      <w:r>
-        <w:t xml:space="preserve">Epigenetic drift represents yet another source of stochastic variation. Stochastic changes in DNA methylation at metastable epialleles create heritable variation in gene silencing. Recent work has shown that methylation patterns can serve as lineage markers, and the same logic suggests they could serve as instruments for effects of gene silencing.</w:t>
-      </w:r>
-    </w:p>
-    <w:p>
-      <w:pPr>
-        <w:pStyle w:val="BodyText"/>
-      </w:pPr>
-      <w:r>
-        <w:t xml:space="preserve">The general principle is that any source of cell-to-cell variation that is heritable across divisions, independent of microenvironmental confounders, and affects gene expression or function can serve as a somatic instrumental variable.</w:t>
+        <w:t xml:space="preserve">Several limitations constrain the applicability of the SIV framework. The exclusion restriction requires that ecDNA affect phenotypes only through the genes they carry. This assumption could be violated if ecDNA alter global chromatin organization through their circular topology, sequester transcription factors or chromatin modifiers, impose a metabolic burden through replication independent of gene expression, or trigger innate immune sensing through the cGAS-STING pathway detecting cytoplasmic DNA. Current evidence suggests these effects are minor at physiological ecDNA copy numbers, but they have not been rigorously excluded. Single-cell studies comparing cells with matched gene expression but different ecDNA counts (such as ecDNA versus HSR amplification) could test this assumption.</w:t>
+      </w:r>
+    </w:p>
+    <w:p>
+      <w:pPr>
+        <w:pStyle w:val="BodyText"/>
+      </w:pPr>
+      <w:r>
+        <w:t xml:space="preserve">The independence assumption requires that ecDNA segregation is random with respect to microenvironmental confounders. This could be violated if certain microenvironments induce asymmetric cell division that biases ecDNA allocation, if ecDNA copy number affects cell survival differentially across niches (creating selection-driven correlation with microenvironment), or if ecDNA inheritance is coupled to other cellular asymmetries such as the old versus new centrosome. Our simulations validate independence by construction, but real tumors require empirical testing. The key diagnostic is whether daughter ecDNA fraction correlates with microenvironmental variables at the moment of division, which requires live imaging or lineage tracing.</w:t>
+      </w:r>
+    </w:p>
+    <w:p>
+      <w:pPr>
+        <w:pStyle w:val="BodyText"/>
+      </w:pPr>
+      <w:r>
+        <w:t xml:space="preserve">Applying SIV to real data requires ecDNA copy number at single-cell resolution (via FISH, DNA-FISH, or amplicon sequencing), gene expression co-measured in the same cells (via spatial transcriptomics), phenotypic outcomes measurable from spatial data (morphology, neighbors, protein markers), and lineage information for sibling comparisons (via clonal barcoding or live imaging). Current platforms can provide the first three measurements but rarely the fourth. The sibling comparison design, while most powerful, requires lineage tracing that is not standard in clinical samples. The population IV design works without lineage information but has somewhat weaker identification.</w:t>
+      </w:r>
+    </w:p>
+    <w:p>
+      <w:pPr>
+        <w:pStyle w:val="BodyText"/>
+      </w:pPr>
+      <w:r>
+        <w:t xml:space="preserve">CAUSANTA makes simplifying assumptions that limit its biological realism: it operates in two dimensions rather than three, uses phenomenological physics with reaction-diffusion at simplified units, models a single ecDNA species when real tumors often have multiple, assumes fixed effect sizes when real effects may be context-dependent, and excludes treatment and evolution (maintaining static causal structure). These limitations mean CAUSANTA should be interpreted as a causal inference benchmark, not a predictive model of GBM biology. It establishes that IV methods work in principle, but validation in real tumors remains necessary.</w:t>
       </w:r>
     </w:p>
     <w:bookmarkEnd w:id="57"/>
-    <w:bookmarkStart w:id="58" w:name="relation-to-prior-work"/>
+    <w:bookmarkStart w:id="58" w:name="future-directions"/>
     <w:p>
       <w:pPr>
         <w:pStyle w:val="Heading2"/>
       </w:pPr>
       <w:r>
-        <w:t xml:space="preserve">Relation to Prior Work</w:t>
+        <w:t xml:space="preserve">Future Directions</w:t>
       </w:r>
     </w:p>
     <w:p>
@@ -6357,127 +6436,51 @@
         <w:pStyle w:val="FirstParagraph"/>
       </w:pPr>
       <w:r>
-        <w:t xml:space="preserve">The SIV framework builds on three intellectual traditions. The IV methodology was developed by economists to address confounding in observational studies of policy effects (Angrist &amp; Pischke, 2009). Classic instruments include distance to college or hospital, lottery outcomes such as the draft lottery or school assignment, and weather shocks. Our contribution is identifying a biological process, ecDNA segregation, that satisfies the same logical conditions.</w:t>
-      </w:r>
-    </w:p>
-    <w:p>
-      <w:pPr>
-        <w:pStyle w:val="BodyText"/>
-      </w:pPr>
-      <w:r>
-        <w:t xml:space="preserve">The use of genetic variants as instruments for modifiable exposures, known as Mendelian randomization, has transformed epidemiology (Davey Smith &amp; Hemani, 2014). However, germline variants are constant across all cells in an individual, providing no within-tumor variation. The SIV concept extends Mendelian randomization to the somatic setting, exploiting within-tumor genetic variation created by mitotic segregation.</w:t>
-      </w:r>
-    </w:p>
-    <w:p>
-      <w:pPr>
-        <w:pStyle w:val="BodyText"/>
-      </w:pPr>
-      <w:r>
-        <w:t xml:space="preserve">Recent work has begun to address causality in spatial omics, including the use of perturbation data to validate spatial correlations and the development of causal discovery algorithms for spatial graphs. Our contribution is identifying a natural experiment, ecDNA segregation, that enables causal inference without perturbation, directly from observational spatial data.</w:t>
+        <w:t xml:space="preserve">The immediate next step is applying SIV to real spatial multi-omics data from ecDNA-positive tumors. Glioblastoma is an ideal test case given the high prevalence of EGFR-ecDNA (&gt;40%) and the clinical relevance of understanding EGFR-driven phenotypes. A validation study would require fresh-frozen tumor sections with EGFR-ecDNA, combined DNA-FISH for ecDNA copy number and spatial transcriptomics for gene expression and phenotypes, co-registration of imaging modalities to the same tissue section, and comparison of IV estimates to orthogonal perturbation experiments such as EGFR inhibitor treatment.</w:t>
+      </w:r>
+    </w:p>
+    <w:p>
+      <w:pPr>
+        <w:pStyle w:val="BodyText"/>
+      </w:pPr>
+      <w:r>
+        <w:t xml:space="preserve">The sibling comparison design is the most powerful form of SIV analysis because it controls all shared confounders. Implementing this in real tumors requires live imaging of dividing cells with ecDNA reporters. CRISPR-based ecDNA tagging, inserting fluorescent markers into ecDNA combined with long-term organoid imaging, could enable this approach. The resulting data would provide the cleanest test of the SIV framework.</w:t>
+      </w:r>
+    </w:p>
+    <w:p>
+      <w:pPr>
+        <w:pStyle w:val="BodyText"/>
+      </w:pPr>
+      <w:r>
+        <w:t xml:space="preserve">Tumors with multiple ecDNA species (such as EGFR combined with MYC or CDK4) enable multi-instrument designs that can test for violations of the exclusion restriction. If two independent instruments yield the same causal estimate for a given outcome, this provides strong evidence that the exclusion restriction holds for both. Conversely, discordant estimates suggest violations that require investigation.</w:t>
+      </w:r>
+    </w:p>
+    <w:p>
+      <w:pPr>
+        <w:pStyle w:val="BodyText"/>
+      </w:pPr>
+      <w:r>
+        <w:t xml:space="preserve">The current framework uses linear 2SLS, which assumes linear causal effects. Extensions to nonlinear effects could employ double/debiased machine learning (DML) with flexible first and second stages, generalized method of moments (GMM) for nonlinear structural equations, or causal forests for heterogeneous treatment effects across spatial regions.</w:t>
+      </w:r>
+    </w:p>
+    <w:p>
+      <w:pPr>
+        <w:pStyle w:val="BodyText"/>
+      </w:pPr>
+      <w:r>
+        <w:t xml:space="preserve">Foundation models for spatial biology, such as cell embeddings derived from morphology and transcriptomics, could be adapted to incorporate causal structure. Rather than training on correlational objectives like reconstruction and clustering, models could be trained to predict counterfactuals under the SIV identification strategy.</w:t>
+      </w:r>
+    </w:p>
+    <w:p>
+      <w:pPr>
+        <w:pStyle w:val="BodyText"/>
+      </w:pPr>
+      <w:r>
+        <w:t xml:space="preserve">If SIV analysis reveals that EGFR’s causal effect on invasion is strongest at the tumor margin, this suggests a hypothesis for clinical testing: spatially targeted delivery of EGFR inhibitors to the margin may be more effective than systemic therapy. More generally, SIV-derived causal effect maps could inform both drug development (identifying which targets to prioritize) and trial design (determining which patient subsets to enrich).</w:t>
       </w:r>
     </w:p>
     <w:bookmarkEnd w:id="58"/>
-    <w:bookmarkStart w:id="59" w:name="limitations-and-assumptions"/>
-    <w:p>
-      <w:pPr>
-        <w:pStyle w:val="Heading2"/>
-      </w:pPr>
-      <w:r>
-        <w:t xml:space="preserve">Limitations and Assumptions</w:t>
-      </w:r>
-    </w:p>
-    <w:p>
-      <w:pPr>
-        <w:pStyle w:val="FirstParagraph"/>
-      </w:pPr>
-      <w:r>
-        <w:t xml:space="preserve">Several limitations constrain the applicability of the SIV framework. The exclusion restriction requires that ecDNA affect phenotypes only through the genes they carry. This assumption could be violated if ecDNA alter global chromatin organization through their circular topology, sequester transcription factors or chromatin modifiers, impose a metabolic burden through replication independent of gene expression, or trigger innate immune sensing through the cGAS-STING pathway detecting cytoplasmic DNA. Current evidence suggests these effects are minor at physiological ecDNA copy numbers, but they have not been rigorously excluded. Single-cell studies comparing cells with matched gene expression but different ecDNA counts (such as ecDNA versus HSR amplification) could test this assumption.</w:t>
-      </w:r>
-    </w:p>
-    <w:p>
-      <w:pPr>
-        <w:pStyle w:val="BodyText"/>
-      </w:pPr>
-      <w:r>
-        <w:t xml:space="preserve">The independence assumption requires that ecDNA segregation is random with respect to microenvironmental confounders. This could be violated if certain microenvironments induce asymmetric cell division that biases ecDNA allocation, if ecDNA copy number affects cell survival differentially across niches (creating selection-driven correlation with microenvironment), or if ecDNA inheritance is coupled to other cellular asymmetries such as the old versus new centrosome. Our simulations validate independence by construction, but real tumors require empirical testing. The key diagnostic is whether daughter ecDNA fraction correlates with microenvironmental variables at the moment of division, which requires live imaging or lineage tracing.</w:t>
-      </w:r>
-    </w:p>
-    <w:p>
-      <w:pPr>
-        <w:pStyle w:val="BodyText"/>
-      </w:pPr>
-      <w:r>
-        <w:t xml:space="preserve">Applying SIV to real data requires ecDNA copy number at single-cell resolution (via FISH, DNA-FISH, or amplicon sequencing), gene expression co-measured in the same cells (via spatial transcriptomics), phenotypic outcomes measurable from spatial data (morphology, neighbors, protein markers), and lineage information for sibling comparisons (via clonal barcoding or live imaging). Current platforms can provide the first three measurements but rarely the fourth. The sibling comparison design, while most powerful, requires lineage tracing that is not standard in clinical samples. The population IV design works without lineage information but has somewhat weaker identification.</w:t>
-      </w:r>
-    </w:p>
-    <w:p>
-      <w:pPr>
-        <w:pStyle w:val="BodyText"/>
-      </w:pPr>
-      <w:r>
-        <w:t xml:space="preserve">CAUSANTA makes simplifying assumptions that limit its biological realism: it operates in two dimensions rather than three, uses phenomenological physics with reaction-diffusion at simplified units, models a single ecDNA species when real tumors often have multiple, assumes fixed effect sizes when real effects may be context-dependent, and excludes treatment and evolution (maintaining static causal structure). These limitations mean CAUSANTA should be interpreted as a causal inference benchmark, not a predictive model of GBM biology. It establishes that IV methods work in principle, but validation in real tumors remains necessary.</w:t>
-      </w:r>
-    </w:p>
-    <w:bookmarkEnd w:id="59"/>
-    <w:bookmarkStart w:id="60" w:name="future-directions"/>
-    <w:p>
-      <w:pPr>
-        <w:pStyle w:val="Heading2"/>
-      </w:pPr>
-      <w:r>
-        <w:t xml:space="preserve">Future Directions</w:t>
-      </w:r>
-    </w:p>
-    <w:p>
-      <w:pPr>
-        <w:pStyle w:val="FirstParagraph"/>
-      </w:pPr>
-      <w:r>
-        <w:t xml:space="preserve">The immediate next step is applying SIV to real spatial multi-omics data from ecDNA-positive tumors. Glioblastoma is an ideal test case given the high prevalence of EGFR-ecDNA (&gt;40%) and the clinical relevance of understanding EGFR-driven phenotypes. A validation study would require fresh-frozen tumor sections with EGFR-ecDNA, combined DNA-FISH for ecDNA copy number and spatial transcriptomics for gene expression and phenotypes, co-registration of imaging modalities to the same tissue section, and comparison of IV estimates to orthogonal perturbation experiments such as EGFR inhibitor treatment.</w:t>
-      </w:r>
-    </w:p>
-    <w:p>
-      <w:pPr>
-        <w:pStyle w:val="BodyText"/>
-      </w:pPr>
-      <w:r>
-        <w:t xml:space="preserve">The sibling comparison design is the most powerful form of SIV analysis because it controls all shared confounders. Implementing this in real tumors requires live imaging of dividing cells with ecDNA reporters. CRISPR-based ecDNA tagging, inserting fluorescent markers into ecDNA combined with long-term organoid imaging, could enable this approach. The resulting data would provide the cleanest test of the SIV framework.</w:t>
-      </w:r>
-    </w:p>
-    <w:p>
-      <w:pPr>
-        <w:pStyle w:val="BodyText"/>
-      </w:pPr>
-      <w:r>
-        <w:t xml:space="preserve">Tumors with multiple ecDNA species (such as EGFR combined with MYC or CDK4) enable multi-instrument designs that can test for violations of the exclusion restriction. If two independent instruments yield the same causal estimate for a given outcome, this provides strong evidence that the exclusion restriction holds for both. Conversely, discordant estimates suggest violations that require investigation.</w:t>
-      </w:r>
-    </w:p>
-    <w:p>
-      <w:pPr>
-        <w:pStyle w:val="BodyText"/>
-      </w:pPr>
-      <w:r>
-        <w:t xml:space="preserve">The current framework uses linear 2SLS, which assumes linear causal effects. Extensions to nonlinear effects could employ double/debiased machine learning (DML) with flexible first and second stages, generalized method of moments (GMM) for nonlinear structural equations, or causal forests for heterogeneous treatment effects across spatial regions.</w:t>
-      </w:r>
-    </w:p>
-    <w:p>
-      <w:pPr>
-        <w:pStyle w:val="BodyText"/>
-      </w:pPr>
-      <w:r>
-        <w:t xml:space="preserve">Foundation models for spatial biology, such as cell embeddings derived from morphology and transcriptomics, could be adapted to incorporate causal structure. Rather than training on correlational objectives like reconstruction and clustering, models could be trained to predict counterfactuals under the SIV identification strategy.</w:t>
-      </w:r>
-    </w:p>
-    <w:p>
-      <w:pPr>
-        <w:pStyle w:val="BodyText"/>
-      </w:pPr>
-      <w:r>
-        <w:t xml:space="preserve">If SIV analysis reveals that EGFR’s causal effect on invasion is strongest at the tumor margin, this suggests a hypothesis for clinical testing: spatially targeted delivery of EGFR inhibitors to the margin may be more effective than systemic therapy. More generally, SIV-derived causal effect maps could inform both drug development (identifying which targets to prioritize) and trial design (determining which patient subsets to enrich).</w:t>
-      </w:r>
-    </w:p>
-    <w:bookmarkEnd w:id="60"/>
-    <w:bookmarkStart w:id="61" w:name="conclusion"/>
+    <w:bookmarkStart w:id="59" w:name="conclusion"/>
     <w:p>
       <w:pPr>
         <w:pStyle w:val="Heading2"/>
@@ -7251,8 +7254,8 @@
         <w:t xml:space="preserve">, 203-205 (2022). PMID:PMID DOI: 10.1016/j.jclinepi.2022.06.022</w:t>
       </w:r>
     </w:p>
-    <w:bookmarkEnd w:id="61"/>
-    <w:bookmarkEnd w:id="62"/>
+    <w:bookmarkEnd w:id="59"/>
+    <w:bookmarkEnd w:id="60"/>
     <w:sectPr>
       <w:footnotePr>
         <w:numRestart w:val="eachSect"/>

</xml_diff>